<commit_message>
docs(HCO v2): IPC policy fixes
</commit_message>
<xml_diff>
--- a/policies/build/chapters_v2/IPC/HCO_IPC_1_v2_REWRITE_DRAFT.docx
+++ b/policies/build/chapters_v2/IPC/HCO_IPC_1_v2_REWRITE_DRAFT.docx
@@ -2115,7 +2115,19 @@
         <w:pStyle w:val="ListNumber"/>
       </w:pPr>
       <w:r>
-        <w:t>WHO Infection Prevention and Control Assessment Framework at the Facility Level (WHO IPCAF). World Health Organization.</w:t>
+        <w:t xml:space="preserve">World Health Organization. (2018). </w:t>
+      </w:r>
+      <w:hyperlink r:id="rId9">
+        <w:r>
+          <w:rPr>
+            <w:color w:val="0563C1"/>
+            <w:u w:val="single"/>
+          </w:rPr>
+          <w:t>https://www.who.int/publications/i/item/WHO-HIS-SDS-2018.9</w:t>
+        </w:r>
+      </w:hyperlink>
+      <w:r>
+        <w:t xml:space="preserve"> Infection Prevention and Control Assessment Framework at the Facility Level (IPCAF).</w:t>
       </w:r>
     </w:p>
     <w:p>
@@ -2123,7 +2135,19 @@
         <w:pStyle w:val="ListNumber"/>
       </w:pPr>
       <w:r>
-        <w:t>CDC Infection Prevention and Control Assessment Tool for Acute Care Hospitals. Centers for Disease Control and Prevention.</w:t>
+        <w:t xml:space="preserve">Centers for Disease Control and Prevention. (2016). </w:t>
+      </w:r>
+      <w:hyperlink r:id="rId10">
+        <w:r>
+          <w:rPr>
+            <w:color w:val="0563C1"/>
+            <w:u w:val="single"/>
+          </w:rPr>
+          <w:t>https://stacks.cdc.gov/view/cdc/49679</w:t>
+        </w:r>
+      </w:hyperlink>
+      <w:r>
+        <w:t xml:space="preserve"> Infection Prevention and Control Assessment Tool for Acute Care Hospitals (Version 1.3.2).</w:t>
       </w:r>
     </w:p>
     <w:p>

</xml_diff>